<commit_message>
Changes to be committed: 	new file:   .~lock.Chapter_3_Methodology.docx# 	modified:   .~lock.Chapter_4_Implementation.docx# 	modified:   App.tsx 	modified:   Chapter_3_Methodology.docx 	modified:   Chapter_4_Implementation.docx 	modified:   components/AIAdvisor.tsx 	modified:   components/EducationHub.tsx 	modified:   components/LoginPage.tsx 	modified:   components/MobileNav.tsx 	modified:   components/Sidebar.tsx 	modified:   components/auth/SignInForm.tsx 	modified:   services/ai/GeminiProvider.ts 	modified:   services/ai/NvidiaNIMProvider.ts
</commit_message>
<xml_diff>
--- a/Chapter_3_Methodology.docx
+++ b/Chapter_3_Methodology.docx
@@ -38,61 +38,6 @@
           <w:szCs w:val="28"/>
         </w:rPr>
         <w:t>METHODOLOGY</w:t>
-      </w:r>
-    </w:p>
-    <w:p>
-      <w:pPr>
-        <w:pStyle w:val="Normal"/>
-        <w:jc w:val="center"/>
-        <w:rPr>
-          <w:sz w:val="28"/>
-          <w:szCs w:val="28"/>
-        </w:rPr>
-      </w:pPr>
-      <w:r>
-        <w:rPr>
-          <w:i/>
-          <w:sz w:val="28"/>
-          <w:szCs w:val="28"/>
-        </w:rPr>
-        <w:t>AgriFlow - Smart Farm App For West African Farmers</w:t>
-      </w:r>
-    </w:p>
-    <w:p>
-      <w:pPr>
-        <w:pStyle w:val="Normal"/>
-        <w:jc w:val="center"/>
-        <w:rPr>
-          <w:sz w:val="28"/>
-          <w:szCs w:val="28"/>
-        </w:rPr>
-      </w:pPr>
-      <w:r>
-        <w:rPr>
-          <w:color w:val="474747"/>
-          <w:sz w:val="28"/>
-          <w:szCs w:val="28"/>
-        </w:rPr>
-        <w:t xml:space="preserve">ATU Diploma in Information Technology </w:t>
-        <w:br/>
-        <w:t>Group 8</w:t>
-        <w:br/>
-        <w:t>Bernice · Donald · Confidence · Daniel · Richmond</w:t>
-      </w:r>
-    </w:p>
-    <w:p>
-      <w:pPr>
-        <w:pStyle w:val="Normal"/>
-        <w:rPr>
-          <w:sz w:val="28"/>
-          <w:szCs w:val="28"/>
-        </w:rPr>
-      </w:pPr>
-      <w:r>
-        <w:rPr>
-          <w:sz w:val="28"/>
-          <w:szCs w:val="28"/>
-        </w:rPr>
       </w:r>
     </w:p>
     <w:p>
@@ -502,7 +447,7 @@
         <w:rPr/>
         <w:drawing>
           <wp:inline distT="0" distB="0" distL="0" distR="0">
-            <wp:extent cx="5715000" cy="5861050"/>
+            <wp:extent cx="6090285" cy="6032500"/>
             <wp:effectExtent l="0" t="0" r="0" b="0"/>
             <wp:docPr id="1" name="Picture 1"/>
             <wp:cNvGraphicFramePr>
@@ -519,6 +464,7 @@
                   </pic:nvPicPr>
                   <pic:blipFill>
                     <a:blip r:embed="rId2"/>
+                    <a:srcRect l="2576" t="5900" r="0" b="0"/>
                     <a:stretch>
                       <a:fillRect/>
                     </a:stretch>
@@ -526,12 +472,21 @@
                   <pic:spPr bwMode="auto">
                     <a:xfrm>
                       <a:off x="0" y="0"/>
-                      <a:ext cx="5715000" cy="5861050"/>
+                      <a:ext cx="6090285" cy="6032500"/>
                     </a:xfrm>
                     <a:prstGeom prst="rect">
                       <a:avLst/>
                     </a:prstGeom>
-                    <a:noFill/>
+                    <a:pattFill prst="horz">
+                      <a:fgClr>
+                        <a:srgbClr val="000000"/>
+                      </a:fgClr>
+                      <a:bgClr>
+                        <a:srgbClr val="FFFFFF">
+                          <a:alpha val="0"/>
+                        </a:srgbClr>
+                      </a:bgClr>
+                    </a:pattFill>
                   </pic:spPr>
                 </pic:pic>
               </a:graphicData>
@@ -592,6 +547,40 @@
           <w:szCs w:val="28"/>
         </w:rPr>
         <w:t>Table 3.1 below presents the full functional requirements. Each requirement has a unique identifier (FR-xx), a name, the originating actor, and an acceptance criterion. Non-functional requirements follow in Table 3.2.</w:t>
+      </w:r>
+    </w:p>
+    <w:p>
+      <w:pPr>
+        <w:pStyle w:val="Normal"/>
+        <w:spacing w:before="0" w:after="120"/>
+        <w:jc w:val="both"/>
+        <w:rPr>
+          <w:sz w:val="28"/>
+          <w:szCs w:val="28"/>
+        </w:rPr>
+      </w:pPr>
+      <w:r>
+        <w:rPr>
+          <w:sz w:val="28"/>
+          <w:szCs w:val="28"/>
+        </w:rPr>
+      </w:r>
+    </w:p>
+    <w:p>
+      <w:pPr>
+        <w:pStyle w:val="Normal"/>
+        <w:spacing w:before="0" w:after="120"/>
+        <w:jc w:val="both"/>
+        <w:rPr>
+          <w:sz w:val="28"/>
+          <w:szCs w:val="28"/>
+        </w:rPr>
+      </w:pPr>
+      <w:r>
+        <w:rPr>
+          <w:sz w:val="28"/>
+          <w:szCs w:val="28"/>
+        </w:rPr>
       </w:r>
     </w:p>
     <w:tbl>

</xml_diff>